<commit_message>
Implemented Sep 11 2026 feedback
</commit_message>
<xml_diff>
--- a/docassemble/NoticeOfDeathAffidavit/data/templates/noda_instructions.docx
+++ b/docassemble/NoticeOfDeathAffidavit/data/templates/noda_instructions.docx
@@ -21,7 +21,7 @@
             <w:tcBorders>
               <w:top w:val="nil"/>
               <w:left w:val="nil"/>
-              <w:bottom w:val="single" w:sz="4" w:space="0" w:color="auto"/>
+              <w:bottom w:val="nil"/>
               <w:right w:val="nil"/>
             </w:tcBorders>
           </w:tcPr>
@@ -29,23 +29,27 @@
             <w:pPr>
               <w:rPr>
                 <w:rFonts w:ascii="Verdana" w:hAnsi="Verdana" w:cs="Arial"/>
+                <w:b/>
+                <w:bCs/>
+                <w:sz w:val="16"/>
+                <w:szCs w:val="16"/>
               </w:rPr>
             </w:pPr>
             <w:r>
               <w:rPr>
                 <w:rFonts w:ascii="Verdana" w:hAnsi="Verdana" w:cs="Arial"/>
                 <w:noProof/>
-                <w:sz w:val="32"/>
-                <w:szCs w:val="32"/>
+                <w:sz w:val="16"/>
+                <w:szCs w:val="16"/>
               </w:rPr>
               <w:drawing>
-                <wp:anchor distT="0" distB="0" distL="114300" distR="114300" simplePos="0" relativeHeight="251659264" behindDoc="0" locked="0" layoutInCell="1" allowOverlap="1" wp14:anchorId="697C00C3" wp14:editId="55361BE5">
+                <wp:anchor distT="0" distB="0" distL="114300" distR="114300" simplePos="0" relativeHeight="251659264" behindDoc="0" locked="0" layoutInCell="1" allowOverlap="1" wp14:anchorId="697C00C3" wp14:editId="67D8BE1C">
                   <wp:simplePos x="0" y="0"/>
                   <wp:positionH relativeFrom="column">
-                    <wp:posOffset>2540</wp:posOffset>
+                    <wp:posOffset>5289732</wp:posOffset>
                   </wp:positionH>
                   <wp:positionV relativeFrom="paragraph">
-                    <wp:posOffset>12700</wp:posOffset>
+                    <wp:posOffset>363</wp:posOffset>
                   </wp:positionV>
                   <wp:extent cx="1143000" cy="640715"/>
                   <wp:effectExtent l="0" t="0" r="0" b="6985"/>
@@ -62,7 +66,7 @@
                           <pic:cNvPicPr/>
                         </pic:nvPicPr>
                         <pic:blipFill>
-                          <a:blip r:embed="rId5" cstate="print">
+                          <a:blip r:embed="rId7" cstate="print">
                             <a:extLst>
                               <a:ext uri="{28A0092B-C50C-407E-A947-70E740481C1C}">
                                 <a14:useLocalDpi xmlns:a14="http://schemas.microsoft.com/office/drawing/2010/main" val="0"/>
@@ -98,8 +102,8 @@
                 <w:rFonts w:ascii="Verdana" w:hAnsi="Verdana" w:cs="Arial"/>
                 <w:b/>
                 <w:bCs/>
-                <w:sz w:val="32"/>
-                <w:szCs w:val="32"/>
+                <w:sz w:val="40"/>
+                <w:szCs w:val="40"/>
               </w:rPr>
             </w:pPr>
             <w:r>
@@ -107,20 +111,38 @@
                 <w:rFonts w:ascii="Verdana" w:hAnsi="Verdana" w:cs="Arial"/>
                 <w:b/>
                 <w:bCs/>
-                <w:sz w:val="32"/>
-                <w:szCs w:val="32"/>
-              </w:rPr>
-              <w:t xml:space="preserve">How to use a </w:t>
-            </w:r>
-            <w:r>
+                <w:sz w:val="40"/>
+                <w:szCs w:val="40"/>
+              </w:rPr>
+              <w:t>Notice of Death Affidavit</w:t>
+            </w:r>
+          </w:p>
+          <w:p>
+            <w:pPr>
               <w:rPr>
                 <w:rFonts w:ascii="Verdana" w:hAnsi="Verdana" w:cs="Arial"/>
                 <w:b/>
                 <w:bCs/>
-                <w:sz w:val="32"/>
-                <w:szCs w:val="32"/>
-              </w:rPr>
-              <w:t>Notice of Death Affidavit</w:t>
+                <w:sz w:val="28"/>
+                <w:szCs w:val="28"/>
+              </w:rPr>
+            </w:pPr>
+          </w:p>
+          <w:p>
+            <w:pPr>
+              <w:rPr>
+                <w:rFonts w:ascii="Verdana" w:hAnsi="Verdana" w:cs="Arial"/>
+                <w:sz w:val="28"/>
+                <w:szCs w:val="28"/>
+              </w:rPr>
+            </w:pPr>
+            <w:r>
+              <w:rPr>
+                <w:rFonts w:ascii="Verdana" w:hAnsi="Verdana" w:cs="Arial"/>
+                <w:sz w:val="28"/>
+                <w:szCs w:val="28"/>
+              </w:rPr>
+              <w:t>Instructions</w:t>
             </w:r>
           </w:p>
         </w:tc>
@@ -130,7 +152,7 @@
           <w:tcPr>
             <w:tcW w:w="10800" w:type="dxa"/>
             <w:tcBorders>
-              <w:top w:val="single" w:sz="4" w:space="0" w:color="auto"/>
+              <w:top w:val="nil"/>
               <w:left w:val="nil"/>
               <w:bottom w:val="single" w:sz="4" w:space="0" w:color="auto"/>
               <w:right w:val="nil"/>
@@ -138,13 +160,22 @@
           </w:tcPr>
           <w:p>
             <w:pPr>
-              <w:pStyle w:val="NoSpacing"/>
-              <w:spacing w:after="40" w:line="360" w:lineRule="auto"/>
-              <w:rPr>
-                <w:rFonts w:ascii="Verdana" w:hAnsi="Verdana" w:cs="Arial"/>
-                <w:b/>
-                <w:sz w:val="16"/>
-                <w:szCs w:val="16"/>
+              <w:pBdr>
+                <w:bottom w:val="single" w:sz="12" w:space="1" w:color="auto"/>
+              </w:pBdr>
+              <w:rPr>
+                <w:rFonts w:ascii="Muli" w:hAnsi="Muli"/>
+                <w:sz w:val="2"/>
+                <w:szCs w:val="2"/>
+              </w:rPr>
+            </w:pPr>
+          </w:p>
+          <w:p>
+            <w:pPr>
+              <w:rPr>
+                <w:rFonts w:ascii="Muli" w:hAnsi="Muli"/>
+                <w:sz w:val="28"/>
+                <w:szCs w:val="28"/>
               </w:rPr>
             </w:pPr>
           </w:p>
@@ -427,6 +458,118 @@
                 <w:sz w:val="24"/>
                 <w:szCs w:val="24"/>
               </w:rPr>
+              <w:t xml:space="preserve">Add the name and address of the </w:t>
+            </w:r>
+            <w:r>
+              <w:rPr>
+                <w:rFonts w:ascii="Verdana" w:hAnsi="Verdana" w:cs="Arial"/>
+                <w:sz w:val="24"/>
+                <w:szCs w:val="24"/>
+              </w:rPr>
+              <w:t xml:space="preserve">Recorder of Deeds office in </w:t>
+            </w:r>
+            <w:proofErr w:type="gramStart"/>
+            <w:r>
+              <w:rPr>
+                <w:rFonts w:ascii="Verdana" w:hAnsi="Verdana" w:cs="Arial"/>
+                <w:sz w:val="24"/>
+                <w:szCs w:val="24"/>
+              </w:rPr>
+              <w:t xml:space="preserve">{{ </w:t>
+            </w:r>
+            <w:proofErr w:type="spellStart"/>
+            <w:r>
+              <w:rPr>
+                <w:rFonts w:ascii="Verdana" w:hAnsi="Verdana" w:cs="Arial"/>
+                <w:sz w:val="24"/>
+                <w:szCs w:val="24"/>
+              </w:rPr>
+              <w:t>end</w:t>
+            </w:r>
+            <w:proofErr w:type="gramEnd"/>
+            <w:r>
+              <w:rPr>
+                <w:rFonts w:ascii="Verdana" w:hAnsi="Verdana" w:cs="Arial"/>
+                <w:sz w:val="24"/>
+                <w:szCs w:val="24"/>
+              </w:rPr>
+              <w:t>_in_county</w:t>
+            </w:r>
+            <w:proofErr w:type="spellEnd"/>
+            <w:r>
+              <w:rPr>
+                <w:rFonts w:ascii="Verdana" w:hAnsi="Verdana" w:cs="Arial"/>
+                <w:sz w:val="24"/>
+                <w:szCs w:val="24"/>
+              </w:rPr>
+              <w:t>(</w:t>
+            </w:r>
+            <w:proofErr w:type="spellStart"/>
+            <w:r>
+              <w:rPr>
+                <w:rFonts w:ascii="Verdana" w:hAnsi="Verdana" w:cs="Arial"/>
+                <w:sz w:val="24"/>
+                <w:szCs w:val="24"/>
+              </w:rPr>
+              <w:t>notice_</w:t>
+            </w:r>
+            <w:proofErr w:type="gramStart"/>
+            <w:r>
+              <w:rPr>
+                <w:rFonts w:ascii="Verdana" w:hAnsi="Verdana" w:cs="Arial"/>
+                <w:sz w:val="24"/>
+                <w:szCs w:val="24"/>
+              </w:rPr>
+              <w:t>property.county</w:t>
+            </w:r>
+            <w:proofErr w:type="spellEnd"/>
+            <w:proofErr w:type="gramEnd"/>
+            <w:r>
+              <w:rPr>
+                <w:rFonts w:ascii="Verdana" w:hAnsi="Verdana" w:cs="Arial"/>
+                <w:sz w:val="24"/>
+                <w:szCs w:val="24"/>
+              </w:rPr>
+              <w:t>)}}</w:t>
+            </w:r>
+            <w:r>
+              <w:rPr>
+                <w:rFonts w:ascii="Verdana" w:hAnsi="Verdana" w:cs="Arial"/>
+                <w:sz w:val="24"/>
+                <w:szCs w:val="24"/>
+              </w:rPr>
+              <w:t xml:space="preserve"> to the “Mail to” field</w:t>
+            </w:r>
+            <w:r>
+              <w:rPr>
+                <w:rFonts w:ascii="Verdana" w:hAnsi="Verdana" w:cs="Arial"/>
+                <w:sz w:val="24"/>
+                <w:szCs w:val="24"/>
+              </w:rPr>
+              <w:t xml:space="preserve"> on the first page of the Notice of Death Affidavit.</w:t>
+            </w:r>
+          </w:p>
+          <w:p>
+            <w:pPr>
+              <w:pStyle w:val="NoSpacing"/>
+              <w:numPr>
+                <w:ilvl w:val="0"/>
+                <w:numId w:val="4"/>
+              </w:numPr>
+              <w:spacing w:after="40" w:line="360" w:lineRule="auto"/>
+              <w:ind w:left="360"/>
+              <w:rPr>
+                <w:rFonts w:ascii="Verdana" w:hAnsi="Verdana" w:cs="Arial"/>
+                <w:sz w:val="24"/>
+                <w:szCs w:val="24"/>
+              </w:rPr>
+            </w:pPr>
+            <w:r>
+              <w:rPr>
+                <w:rFonts w:ascii="Verdana" w:hAnsi="Verdana" w:cs="Arial"/>
+                <w:sz w:val="24"/>
+                <w:szCs w:val="24"/>
+              </w:rPr>
               <w:t xml:space="preserve">You </w:t>
             </w:r>
             <w:r>
@@ -497,15 +640,33 @@
                 <w:sz w:val="24"/>
                 <w:szCs w:val="24"/>
               </w:rPr>
-              <w:t xml:space="preserve">and the other beneficiaries </w:t>
-            </w:r>
-            <w:r>
-              <w:rPr>
-                <w:rFonts w:ascii="Verdana" w:hAnsi="Verdana" w:cs="Arial"/>
-                <w:sz w:val="24"/>
-                <w:szCs w:val="24"/>
-              </w:rPr>
-              <w:t xml:space="preserve">{% endif %} must sign and date the </w:t>
+              <w:t xml:space="preserve">and the other </w:t>
+            </w:r>
+            <w:proofErr w:type="gramStart"/>
+            <w:r>
+              <w:rPr>
+                <w:rFonts w:ascii="Verdana" w:hAnsi="Verdana" w:cs="Arial"/>
+                <w:sz w:val="24"/>
+                <w:szCs w:val="24"/>
+              </w:rPr>
+              <w:t>beneficiaries</w:t>
+            </w:r>
+            <w:r>
+              <w:rPr>
+                <w:rFonts w:ascii="Verdana" w:hAnsi="Verdana" w:cs="Arial"/>
+                <w:sz w:val="24"/>
+                <w:szCs w:val="24"/>
+              </w:rPr>
+              <w:t>{</w:t>
+            </w:r>
+            <w:proofErr w:type="gramEnd"/>
+            <w:r>
+              <w:rPr>
+                <w:rFonts w:ascii="Verdana" w:hAnsi="Verdana" w:cs="Arial"/>
+                <w:sz w:val="24"/>
+                <w:szCs w:val="24"/>
+              </w:rPr>
+              <w:t xml:space="preserve">% endif %} must sign and date the </w:t>
             </w:r>
             <w:r>
               <w:rPr>
@@ -537,7 +698,7 @@
                 <w:sz w:val="24"/>
                 <w:szCs w:val="24"/>
               </w:rPr>
-              <w:t xml:space="preserve">A notary public can usually be found at your local courthouse, banks, and law offices. The notary will stamp your charge form to confirm that you signed under oath. </w:t>
+              <w:t xml:space="preserve">A notary public can usually be found at your local courthouse, banks, and law offices. The notary will stamp your form to confirm that you signed under oath. </w:t>
             </w:r>
           </w:p>
           <w:p>
@@ -585,7 +746,7 @@
                 <w:sz w:val="24"/>
                 <w:szCs w:val="24"/>
               </w:rPr>
-              <w:t>There may be a small fee (usually $1) for the notary’s services.</w:t>
+              <w:t>There may be a small fee for the notary’s services.</w:t>
             </w:r>
           </w:p>
           <w:p>
@@ -713,15 +874,7 @@
                 <w:sz w:val="24"/>
                 <w:szCs w:val="24"/>
               </w:rPr>
-              <w:t>within</w:t>
-            </w:r>
-            <w:r>
-              <w:rPr>
-                <w:rFonts w:ascii="Verdana" w:hAnsi="Verdana" w:cs="Arial"/>
-                <w:sz w:val="24"/>
-                <w:szCs w:val="24"/>
-              </w:rPr>
-              <w:t xml:space="preserve"> two years of </w:t>
+              <w:t xml:space="preserve">within two years of </w:t>
             </w:r>
             <w:r>
               <w:rPr>
@@ -888,7 +1041,7 @@
                 <w:sz w:val="24"/>
                 <w:szCs w:val="24"/>
               </w:rPr>
-              <w:t>death.</w:t>
+              <w:t>death</w:t>
             </w:r>
             <w:r>
               <w:rPr>
@@ -906,6 +1059,14 @@
                 <w:szCs w:val="24"/>
               </w:rPr>
               <w:t>% endif %}</w:t>
+            </w:r>
+            <w:r>
+              <w:rPr>
+                <w:rFonts w:ascii="Verdana" w:hAnsi="Verdana" w:cs="Arial"/>
+                <w:sz w:val="24"/>
+                <w:szCs w:val="24"/>
+              </w:rPr>
+              <w:t>.</w:t>
             </w:r>
           </w:p>
         </w:tc>
@@ -944,7 +1105,7 @@
       </w:pPr>
     </w:p>
     <w:sectPr>
-      <w:footerReference w:type="default" r:id="rId6"/>
+      <w:footerReference w:type="default" r:id="rId8"/>
       <w:pgSz w:w="12240" w:h="15840"/>
       <w:pgMar w:top="720" w:right="720" w:bottom="720" w:left="720" w:header="720" w:footer="720" w:gutter="0"/>
       <w:cols w:space="720"/>
@@ -954,6 +1115,25 @@
 </w:document>
 </file>
 
+<file path=word/endnotes.xml><?xml version="1.0" encoding="utf-8"?>
+<w:endnotes xmlns:wpc="http://schemas.microsoft.com/office/word/2010/wordprocessingCanvas" xmlns:cx="http://schemas.microsoft.com/office/drawing/2014/chartex" xmlns:cx1="http://schemas.microsoft.com/office/drawing/2015/9/8/chartex" xmlns:cx2="http://schemas.microsoft.com/office/drawing/2015/10/21/chartex" xmlns:cx3="http://schemas.microsoft.com/office/drawing/2016/5/9/chartex" xmlns:cx4="http://schemas.microsoft.com/office/drawing/2016/5/10/chartex" xmlns:cx5="http://schemas.microsoft.com/office/drawing/2016/5/11/chartex" xmlns:cx6="http://schemas.microsoft.com/office/drawing/2016/5/12/chartex" xmlns:cx7="http://schemas.microsoft.com/office/drawing/2016/5/13/chartex" xmlns:cx8="http://schemas.microsoft.com/office/drawing/2016/5/14/chartex" xmlns:mc="http://schemas.openxmlformats.org/markup-compatibility/2006" xmlns:aink="http://schemas.microsoft.com/office/drawing/2016/ink" xmlns:am3d="http://schemas.microsoft.com/office/drawing/2017/model3d" xmlns:o="urn:schemas-microsoft-com:office:office" xmlns:oel="http://schemas.microsoft.com/office/2019/extlst" xmlns:r="http://schemas.openxmlformats.org/officeDocument/2006/relationships" xmlns:m="http://schemas.openxmlformats.org/officeDocument/2006/math" xmlns:v="urn:schemas-microsoft-com:vml" xmlns:wp14="http://schemas.microsoft.com/office/word/2010/wordprocessingDrawing" xmlns:wp="http://schemas.openxmlformats.org/drawingml/2006/wordprocessingDrawing" xmlns:w10="urn:schemas-microsoft-com:office:word" xmlns:w="http://schemas.openxmlformats.org/wordprocessingml/2006/main" xmlns:w14="http://schemas.microsoft.com/office/word/2010/wordml" xmlns:w15="http://schemas.microsoft.com/office/word/2012/wordml" xmlns:w16cex="http://schemas.microsoft.com/office/word/2018/wordml/cex" xmlns:w16cid="http://schemas.microsoft.com/office/word/2016/wordml/cid" xmlns:w16="http://schemas.microsoft.com/office/word/2018/wordml" xmlns:w16du="http://schemas.microsoft.com/office/word/2023/wordml/word16du" xmlns:w16sdtdh="http://schemas.microsoft.com/office/word/2020/wordml/sdtdatahash" xmlns:w16sdtfl="http://schemas.microsoft.com/office/word/2024/wordml/sdtformatlock" xmlns:w16se="http://schemas.microsoft.com/office/word/2015/wordml/symex" xmlns:wpg="http://schemas.microsoft.com/office/word/2010/wordprocessingGroup" xmlns:wpi="http://schemas.microsoft.com/office/word/2010/wordprocessingInk" xmlns:wne="http://schemas.microsoft.com/office/word/2006/wordml" xmlns:wps="http://schemas.microsoft.com/office/word/2010/wordprocessingShape" mc:Ignorable="w14 w15 w16se w16cid w16 w16cex w16sdtdh w16sdtfl w16du wp14">
+  <w:endnote w:type="separator" w:id="-1">
+    <w:p>
+      <w:r>
+        <w:separator/>
+      </w:r>
+    </w:p>
+  </w:endnote>
+  <w:endnote w:type="continuationSeparator" w:id="0">
+    <w:p>
+      <w:r>
+        <w:continuationSeparator/>
+      </w:r>
+    </w:p>
+  </w:endnote>
+</w:endnotes>
+</file>
+
 <file path=word/footer1.xml><?xml version="1.0" encoding="utf-8"?>
 <w:ftr xmlns:wpc="http://schemas.microsoft.com/office/word/2010/wordprocessingCanvas" xmlns:cx="http://schemas.microsoft.com/office/drawing/2014/chartex" xmlns:cx1="http://schemas.microsoft.com/office/drawing/2015/9/8/chartex" xmlns:cx2="http://schemas.microsoft.com/office/drawing/2015/10/21/chartex" xmlns:cx3="http://schemas.microsoft.com/office/drawing/2016/5/9/chartex" xmlns:cx4="http://schemas.microsoft.com/office/drawing/2016/5/10/chartex" xmlns:cx5="http://schemas.microsoft.com/office/drawing/2016/5/11/chartex" xmlns:cx6="http://schemas.microsoft.com/office/drawing/2016/5/12/chartex" xmlns:cx7="http://schemas.microsoft.com/office/drawing/2016/5/13/chartex" xmlns:cx8="http://schemas.microsoft.com/office/drawing/2016/5/14/chartex" xmlns:mc="http://schemas.openxmlformats.org/markup-compatibility/2006" xmlns:aink="http://schemas.microsoft.com/office/drawing/2016/ink" xmlns:am3d="http://schemas.microsoft.com/office/drawing/2017/model3d" xmlns:o="urn:schemas-microsoft-com:office:office" xmlns:oel="http://schemas.microsoft.com/office/2019/extlst" xmlns:r="http://schemas.openxmlformats.org/officeDocument/2006/relationships" xmlns:m="http://schemas.openxmlformats.org/officeDocument/2006/math" xmlns:v="urn:schemas-microsoft-com:vml" xmlns:wp14="http://schemas.microsoft.com/office/word/2010/wordprocessingDrawing" xmlns:wp="http://schemas.openxmlformats.org/drawingml/2006/wordprocessingDrawing" xmlns:w10="urn:schemas-microsoft-com:office:word" xmlns:w="http://schemas.openxmlformats.org/wordprocessingml/2006/main" xmlns:w14="http://schemas.microsoft.com/office/word/2010/wordml" xmlns:w15="http://schemas.microsoft.com/office/word/2012/wordml" xmlns:w16cex="http://schemas.microsoft.com/office/word/2018/wordml/cex" xmlns:w16cid="http://schemas.microsoft.com/office/word/2016/wordml/cid" xmlns:w16="http://schemas.microsoft.com/office/word/2018/wordml" xmlns:w16du="http://schemas.microsoft.com/office/word/2023/wordml/word16du" xmlns:w16sdtdh="http://schemas.microsoft.com/office/word/2020/wordml/sdtdatahash" xmlns:w16sdtfl="http://schemas.microsoft.com/office/word/2024/wordml/sdtformatlock" xmlns:w16se="http://schemas.microsoft.com/office/word/2015/wordml/symex" xmlns:wpg="http://schemas.microsoft.com/office/word/2010/wordprocessingGroup" xmlns:wpi="http://schemas.microsoft.com/office/word/2010/wordprocessingInk" xmlns:wne="http://schemas.microsoft.com/office/word/2006/wordml" xmlns:wps="http://schemas.microsoft.com/office/word/2010/wordprocessingShape" mc:Ignorable="w14 w15 w16se w16cid w16 w16cex w16sdtdh w16sdtfl w16du wp14">
   <w:p>
@@ -961,50 +1141,50 @@
       <w:pStyle w:val="Footer"/>
       <w:jc w:val="center"/>
       <w:rPr>
-        <w:rFonts w:ascii="Arial" w:hAnsi="Arial" w:cs="Arial"/>
-        <w:b/>
-        <w:sz w:val="20"/>
-        <w:szCs w:val="20"/>
+        <w:rFonts w:ascii="Verdana" w:hAnsi="Verdana"/>
       </w:rPr>
     </w:pPr>
     <w:r>
       <w:rPr>
-        <w:rFonts w:ascii="Arial" w:hAnsi="Arial" w:cs="Arial"/>
-        <w:b/>
-        <w:sz w:val="20"/>
-        <w:szCs w:val="20"/>
+        <w:rFonts w:ascii="Verdana" w:hAnsi="Verdana"/>
       </w:rPr>
-      <w:t xml:space="preserve">THESE INSTRUCTIONS ARE FOR YOUR PERSONAL USE ONLY. </w:t>
+      <w:t xml:space="preserve">Illinois Legal Aid Online - </w:t>
     </w:r>
-    <w:r>
-      <w:rPr>
-        <w:rFonts w:ascii="Arial" w:hAnsi="Arial" w:cs="Arial"/>
-        <w:b/>
-        <w:sz w:val="20"/>
-        <w:szCs w:val="20"/>
-      </w:rPr>
-      <w:t>YOU DO NOT NEED TO RECORD THEM.</w:t>
-    </w:r>
-  </w:p>
-  <w:p>
-    <w:pPr>
-      <w:pStyle w:val="Footer"/>
-      <w:jc w:val="center"/>
-    </w:pPr>
     <w:hyperlink r:id="rId1" w:history="1">
       <w:r>
         <w:rPr>
           <w:rStyle w:val="Hyperlink"/>
-          <w:rFonts w:ascii="Arial" w:hAnsi="Arial" w:cs="Arial"/>
-          <w:b/>
-          <w:sz w:val="20"/>
-          <w:szCs w:val="20"/>
+          <w:rFonts w:ascii="Verdana" w:hAnsi="Verdana"/>
         </w:rPr>
         <w:t>www.illinoislegalaid.org</w:t>
       </w:r>
     </w:hyperlink>
   </w:p>
+  <w:p>
+    <w:pPr>
+      <w:pStyle w:val="Footer"/>
+    </w:pPr>
+  </w:p>
 </w:ftr>
+</file>
+
+<file path=word/footnotes.xml><?xml version="1.0" encoding="utf-8"?>
+<w:footnotes xmlns:wpc="http://schemas.microsoft.com/office/word/2010/wordprocessingCanvas" xmlns:cx="http://schemas.microsoft.com/office/drawing/2014/chartex" xmlns:cx1="http://schemas.microsoft.com/office/drawing/2015/9/8/chartex" xmlns:cx2="http://schemas.microsoft.com/office/drawing/2015/10/21/chartex" xmlns:cx3="http://schemas.microsoft.com/office/drawing/2016/5/9/chartex" xmlns:cx4="http://schemas.microsoft.com/office/drawing/2016/5/10/chartex" xmlns:cx5="http://schemas.microsoft.com/office/drawing/2016/5/11/chartex" xmlns:cx6="http://schemas.microsoft.com/office/drawing/2016/5/12/chartex" xmlns:cx7="http://schemas.microsoft.com/office/drawing/2016/5/13/chartex" xmlns:cx8="http://schemas.microsoft.com/office/drawing/2016/5/14/chartex" xmlns:mc="http://schemas.openxmlformats.org/markup-compatibility/2006" xmlns:aink="http://schemas.microsoft.com/office/drawing/2016/ink" xmlns:am3d="http://schemas.microsoft.com/office/drawing/2017/model3d" xmlns:o="urn:schemas-microsoft-com:office:office" xmlns:oel="http://schemas.microsoft.com/office/2019/extlst" xmlns:r="http://schemas.openxmlformats.org/officeDocument/2006/relationships" xmlns:m="http://schemas.openxmlformats.org/officeDocument/2006/math" xmlns:v="urn:schemas-microsoft-com:vml" xmlns:wp14="http://schemas.microsoft.com/office/word/2010/wordprocessingDrawing" xmlns:wp="http://schemas.openxmlformats.org/drawingml/2006/wordprocessingDrawing" xmlns:w10="urn:schemas-microsoft-com:office:word" xmlns:w="http://schemas.openxmlformats.org/wordprocessingml/2006/main" xmlns:w14="http://schemas.microsoft.com/office/word/2010/wordml" xmlns:w15="http://schemas.microsoft.com/office/word/2012/wordml" xmlns:w16cex="http://schemas.microsoft.com/office/word/2018/wordml/cex" xmlns:w16cid="http://schemas.microsoft.com/office/word/2016/wordml/cid" xmlns:w16="http://schemas.microsoft.com/office/word/2018/wordml" xmlns:w16du="http://schemas.microsoft.com/office/word/2023/wordml/word16du" xmlns:w16sdtdh="http://schemas.microsoft.com/office/word/2020/wordml/sdtdatahash" xmlns:w16sdtfl="http://schemas.microsoft.com/office/word/2024/wordml/sdtformatlock" xmlns:w16se="http://schemas.microsoft.com/office/word/2015/wordml/symex" xmlns:wpg="http://schemas.microsoft.com/office/word/2010/wordprocessingGroup" xmlns:wpi="http://schemas.microsoft.com/office/word/2010/wordprocessingInk" xmlns:wne="http://schemas.microsoft.com/office/word/2006/wordml" xmlns:wps="http://schemas.microsoft.com/office/word/2010/wordprocessingShape" mc:Ignorable="w14 w15 w16se w16cid w16 w16cex w16sdtdh w16sdtfl w16du wp14">
+  <w:footnote w:type="separator" w:id="-1">
+    <w:p>
+      <w:r>
+        <w:separator/>
+      </w:r>
+    </w:p>
+  </w:footnote>
+  <w:footnote w:type="continuationSeparator" w:id="0">
+    <w:p>
+      <w:r>
+        <w:continuationSeparator/>
+      </w:r>
+    </w:p>
+  </w:footnote>
+</w:footnotes>
 </file>
 
 <file path=word/numbering.xml><?xml version="1.0" encoding="utf-8"?>
@@ -2700,6 +2880,32 @@
       <w14:ligatures w14:val="none"/>
     </w:rPr>
   </w:style>
+  <w:style w:type="paragraph" w:styleId="Header">
+    <w:name w:val="header"/>
+    <w:basedOn w:val="Normal"/>
+    <w:link w:val="HeaderChar"/>
+    <w:uiPriority w:val="99"/>
+    <w:unhideWhenUsed/>
+    <w:rsid w:val="00EF590D"/>
+    <w:pPr>
+      <w:tabs>
+        <w:tab w:val="center" w:pos="4680"/>
+        <w:tab w:val="right" w:pos="9360"/>
+      </w:tabs>
+    </w:pPr>
+  </w:style>
+  <w:style w:type="character" w:customStyle="1" w:styleId="HeaderChar">
+    <w:name w:val="Header Char"/>
+    <w:basedOn w:val="DefaultParagraphFont"/>
+    <w:link w:val="Header"/>
+    <w:uiPriority w:val="99"/>
+    <w:rsid w:val="00EF590D"/>
+    <w:rPr>
+      <w:rFonts w:ascii="Times New Roman" w:eastAsia="Times New Roman" w:hAnsi="Times New Roman" w:cs="Times New Roman"/>
+      <w:kern w:val="0"/>
+      <w14:ligatures w14:val="none"/>
+    </w:rPr>
+  </w:style>
 </w:styles>
 </file>
 

</xml_diff>

<commit_message>
Implemented Sep 17 2026 feedback
</commit_message>
<xml_diff>
--- a/docassemble/NoticeOfDeathAffidavit/data/templates/noda_instructions.docx
+++ b/docassemble/NoticeOfDeathAffidavit/data/templates/noda_instructions.docx
@@ -1192,17 +1192,17 @@
   <w:abstractNum w:abstractNumId="0" w15:restartNumberingAfterBreak="0">
     <w:nsid w:val="037B31DE"/>
     <w:multiLevelType w:val="hybridMultilevel"/>
-    <w:tmpl w:val="A4CA858C"/>
-    <w:lvl w:ilvl="0" w:tplc="04090001">
-      <w:start w:val="1"/>
-      <w:numFmt w:val="bullet"/>
-      <w:lvlText w:val=""/>
+    <w:tmpl w:val="90D26F64"/>
+    <w:lvl w:ilvl="0" w:tplc="0409000F">
+      <w:start w:val="1"/>
+      <w:numFmt w:val="decimal"/>
+      <w:lvlText w:val="%1."/>
       <w:lvlJc w:val="left"/>
       <w:pPr>
         <w:ind w:left="720" w:hanging="360"/>
       </w:pPr>
       <w:rPr>
-        <w:rFonts w:ascii="Symbol" w:hAnsi="Symbol" w:hint="default"/>
+        <w:rFonts w:hint="default"/>
       </w:rPr>
     </w:lvl>
     <w:lvl w:ilvl="1" w:tplc="04090019">

</xml_diff>

<commit_message>
Implemented Sep 21 2026 feedback
</commit_message>
<xml_diff>
--- a/docassemble/NoticeOfDeathAffidavit/data/templates/noda_instructions.docx
+++ b/docassemble/NoticeOfDeathAffidavit/data/templates/noda_instructions.docx
@@ -458,15 +458,7 @@
                 <w:sz w:val="24"/>
                 <w:szCs w:val="24"/>
               </w:rPr>
-              <w:t xml:space="preserve">Add the name and address of the </w:t>
-            </w:r>
-            <w:r>
-              <w:rPr>
-                <w:rFonts w:ascii="Verdana" w:hAnsi="Verdana" w:cs="Arial"/>
-                <w:sz w:val="24"/>
-                <w:szCs w:val="24"/>
-              </w:rPr>
-              <w:t xml:space="preserve">Recorder of Deeds office in </w:t>
+              <w:t xml:space="preserve">Add the name and address of the Recorder of Deeds office in </w:t>
             </w:r>
             <w:proofErr w:type="gramStart"/>
             <w:r>
@@ -530,15 +522,41 @@
                 <w:sz w:val="24"/>
                 <w:szCs w:val="24"/>
               </w:rPr>
-              <w:t>)}}</w:t>
-            </w:r>
-            <w:r>
-              <w:rPr>
-                <w:rFonts w:ascii="Verdana" w:hAnsi="Verdana" w:cs="Arial"/>
-                <w:sz w:val="24"/>
-                <w:szCs w:val="24"/>
-              </w:rPr>
-              <w:t xml:space="preserve"> to the “Mail to” field</w:t>
+              <w:t xml:space="preserve">)}} to the </w:t>
+            </w:r>
+            <w:r>
+              <w:rPr>
+                <w:rFonts w:ascii="Verdana" w:hAnsi="Verdana" w:cs="Arial"/>
+                <w:sz w:val="24"/>
+                <w:szCs w:val="24"/>
+              </w:rPr>
+              <w:t>"</w:t>
+            </w:r>
+            <w:r>
+              <w:rPr>
+                <w:rFonts w:ascii="Verdana" w:hAnsi="Verdana" w:cs="Arial"/>
+                <w:b/>
+                <w:bCs/>
+                <w:sz w:val="24"/>
+                <w:szCs w:val="24"/>
+              </w:rPr>
+              <w:t>MAIL TO:</w:t>
+            </w:r>
+            <w:r>
+              <w:rPr>
+                <w:rFonts w:ascii="Verdana" w:hAnsi="Verdana" w:cs="Arial"/>
+                <w:sz w:val="24"/>
+                <w:szCs w:val="24"/>
+              </w:rPr>
+              <w:t>"</w:t>
+            </w:r>
+            <w:r>
+              <w:rPr>
+                <w:rFonts w:ascii="Verdana" w:hAnsi="Verdana" w:cs="Arial"/>
+                <w:sz w:val="24"/>
+                <w:szCs w:val="24"/>
+              </w:rPr>
+              <w:t xml:space="preserve"> field</w:t>
             </w:r>
             <w:r>
               <w:rPr>
@@ -2475,7 +2493,6 @@
   <w:style w:type="character" w:default="1" w:styleId="DefaultParagraphFont">
     <w:name w:val="Default Paragraph Font"/>
     <w:uiPriority w:val="1"/>
-    <w:semiHidden/>
     <w:unhideWhenUsed/>
   </w:style>
   <w:style w:type="table" w:default="1" w:styleId="TableNormal">

</xml_diff>

<commit_message>
Implemented Sep 24 2026 feedback
</commit_message>
<xml_diff>
--- a/docassemble/NoticeOfDeathAffidavit/data/templates/noda_instructions.docx
+++ b/docassemble/NoticeOfDeathAffidavit/data/templates/noda_instructions.docx
@@ -740,7 +740,15 @@
                 <w:sz w:val="24"/>
                 <w:szCs w:val="24"/>
               </w:rPr>
-              <w:t xml:space="preserve">Bring a photo I.D. when you visit the notary; </w:t>
+              <w:t>Bring a photo I.D. when you visit the notary</w:t>
+            </w:r>
+            <w:r>
+              <w:rPr>
+                <w:rFonts w:ascii="Verdana" w:hAnsi="Verdana" w:cs="Arial"/>
+                <w:sz w:val="24"/>
+                <w:szCs w:val="24"/>
+              </w:rPr>
+              <w:t>.</w:t>
             </w:r>
           </w:p>
           <w:p>

</xml_diff>

<commit_message>
Initial implementation of LCM feedback
</commit_message>
<xml_diff>
--- a/docassemble/NoticeOfDeathAffidavit/data/templates/noda_instructions.docx
+++ b/docassemble/NoticeOfDeathAffidavit/data/templates/noda_instructions.docx
@@ -247,25 +247,7 @@
                 <w:sz w:val="24"/>
                 <w:szCs w:val="24"/>
               </w:rPr>
-              <w:t xml:space="preserve">Notice of Death Affidavit is used when a property owner </w:t>
-            </w:r>
-            <w:proofErr w:type="gramStart"/>
-            <w:r>
-              <w:rPr>
-                <w:rFonts w:ascii="Verdana" w:hAnsi="Verdana" w:cs="Arial"/>
-                <w:sz w:val="24"/>
-                <w:szCs w:val="24"/>
-              </w:rPr>
-              <w:t>dies</w:t>
-            </w:r>
-            <w:proofErr w:type="gramEnd"/>
-            <w:r>
-              <w:rPr>
-                <w:rFonts w:ascii="Verdana" w:hAnsi="Verdana" w:cs="Arial"/>
-                <w:sz w:val="24"/>
-                <w:szCs w:val="24"/>
-              </w:rPr>
-              <w:t xml:space="preserve"> and their property is given to someone else by a </w:t>
+              <w:t xml:space="preserve">Notice of Death Affidavit is used when a property owner dies and their property is given to someone else by a </w:t>
             </w:r>
             <w:r>
               <w:rPr>
@@ -281,25 +263,7 @@
                 <w:sz w:val="24"/>
                 <w:szCs w:val="24"/>
               </w:rPr>
-              <w:t xml:space="preserve">that the owner has </w:t>
-            </w:r>
-            <w:proofErr w:type="gramStart"/>
-            <w:r>
-              <w:rPr>
-                <w:rFonts w:ascii="Verdana" w:hAnsi="Verdana" w:cs="Arial"/>
-                <w:sz w:val="24"/>
-                <w:szCs w:val="24"/>
-              </w:rPr>
-              <w:t>died</w:t>
-            </w:r>
-            <w:proofErr w:type="gramEnd"/>
-            <w:r>
-              <w:rPr>
-                <w:rFonts w:ascii="Verdana" w:hAnsi="Verdana" w:cs="Arial"/>
-                <w:sz w:val="24"/>
-                <w:szCs w:val="24"/>
-              </w:rPr>
-              <w:t xml:space="preserve"> and the property has been transferred to their beneficiaries</w:t>
+              <w:t>that the owner has died and the property has been transferred to their beneficiaries</w:t>
             </w:r>
             <w:r>
               <w:rPr>
@@ -331,25 +295,7 @@
                 <w:sz w:val="24"/>
                 <w:szCs w:val="24"/>
               </w:rPr>
-              <w:t xml:space="preserve">Many people who use </w:t>
-            </w:r>
-            <w:proofErr w:type="gramStart"/>
-            <w:r>
-              <w:rPr>
-                <w:rFonts w:ascii="Verdana" w:hAnsi="Verdana" w:cs="Arial"/>
-                <w:sz w:val="24"/>
-                <w:szCs w:val="24"/>
-              </w:rPr>
-              <w:t>a TODI</w:t>
-            </w:r>
-            <w:proofErr w:type="gramEnd"/>
-            <w:r>
-              <w:rPr>
-                <w:rFonts w:ascii="Verdana" w:hAnsi="Verdana" w:cs="Arial"/>
-                <w:sz w:val="24"/>
-                <w:szCs w:val="24"/>
-              </w:rPr>
-              <w:t xml:space="preserve"> also use a Small Estate Affidavit for the rest of their property. For more information about Small Estate Affidavits, visit </w:t>
+              <w:t xml:space="preserve">Many people who use a TODI also use a Small Estate Affidavit for the rest of their property. For more information about Small Estate Affidavits, visit </w:t>
             </w:r>
             <w:r>
               <w:rPr>
@@ -458,16 +404,7 @@
                 <w:sz w:val="24"/>
                 <w:szCs w:val="24"/>
               </w:rPr>
-              <w:t xml:space="preserve">Add the name and address of the Recorder of Deeds office in </w:t>
-            </w:r>
-            <w:proofErr w:type="gramStart"/>
-            <w:r>
-              <w:rPr>
-                <w:rFonts w:ascii="Verdana" w:hAnsi="Verdana" w:cs="Arial"/>
-                <w:sz w:val="24"/>
-                <w:szCs w:val="24"/>
-              </w:rPr>
-              <w:t xml:space="preserve">{{ </w:t>
+              <w:t xml:space="preserve">Add the name and address of the Recorder of Deeds office in {{ </w:t>
             </w:r>
             <w:proofErr w:type="spellStart"/>
             <w:r>
@@ -476,16 +413,7 @@
                 <w:sz w:val="24"/>
                 <w:szCs w:val="24"/>
               </w:rPr>
-              <w:t>end</w:t>
-            </w:r>
-            <w:proofErr w:type="gramEnd"/>
-            <w:r>
-              <w:rPr>
-                <w:rFonts w:ascii="Verdana" w:hAnsi="Verdana" w:cs="Arial"/>
-                <w:sz w:val="24"/>
-                <w:szCs w:val="24"/>
-              </w:rPr>
-              <w:t>_in_county</w:t>
+              <w:t>end_in_county</w:t>
             </w:r>
             <w:proofErr w:type="spellEnd"/>
             <w:r>
@@ -503,19 +431,9 @@
                 <w:sz w:val="24"/>
                 <w:szCs w:val="24"/>
               </w:rPr>
-              <w:t>notice_</w:t>
-            </w:r>
-            <w:proofErr w:type="gramStart"/>
-            <w:r>
-              <w:rPr>
-                <w:rFonts w:ascii="Verdana" w:hAnsi="Verdana" w:cs="Arial"/>
-                <w:sz w:val="24"/>
-                <w:szCs w:val="24"/>
-              </w:rPr>
-              <w:t>property.county</w:t>
+              <w:t>notice_property.county</w:t>
             </w:r>
             <w:proofErr w:type="spellEnd"/>
-            <w:proofErr w:type="gramEnd"/>
             <w:r>
               <w:rPr>
                 <w:rFonts w:ascii="Verdana" w:hAnsi="Verdana" w:cs="Arial"/>
@@ -599,32 +517,13 @@
               <w:t xml:space="preserve">{% if </w:t>
             </w:r>
             <w:proofErr w:type="spellStart"/>
-            <w:proofErr w:type="gramStart"/>
-            <w:r>
-              <w:rPr>
-                <w:rFonts w:ascii="Verdana" w:hAnsi="Verdana" w:cs="Arial"/>
-                <w:sz w:val="24"/>
-                <w:szCs w:val="24"/>
-              </w:rPr>
-              <w:t>users.number</w:t>
-            </w:r>
-            <w:proofErr w:type="gramEnd"/>
-            <w:r>
-              <w:rPr>
-                <w:rFonts w:ascii="Verdana" w:hAnsi="Verdana" w:cs="Arial"/>
-                <w:sz w:val="24"/>
-                <w:szCs w:val="24"/>
-              </w:rPr>
-              <w:t>_</w:t>
-            </w:r>
-            <w:proofErr w:type="gramStart"/>
-            <w:r>
-              <w:rPr>
-                <w:rFonts w:ascii="Verdana" w:hAnsi="Verdana" w:cs="Arial"/>
-                <w:sz w:val="24"/>
-                <w:szCs w:val="24"/>
-              </w:rPr>
-              <w:t>gathered</w:t>
+            <w:r>
+              <w:rPr>
+                <w:rFonts w:ascii="Verdana" w:hAnsi="Verdana" w:cs="Arial"/>
+                <w:sz w:val="24"/>
+                <w:szCs w:val="24"/>
+              </w:rPr>
+              <w:t>users.number_gathered</w:t>
             </w:r>
             <w:proofErr w:type="spellEnd"/>
             <w:r>
@@ -633,16 +532,7 @@
                 <w:sz w:val="24"/>
                 <w:szCs w:val="24"/>
               </w:rPr>
-              <w:t>(</w:t>
-            </w:r>
-            <w:proofErr w:type="gramEnd"/>
-            <w:r>
-              <w:rPr>
-                <w:rFonts w:ascii="Verdana" w:hAnsi="Verdana" w:cs="Arial"/>
-                <w:sz w:val="24"/>
-                <w:szCs w:val="24"/>
-              </w:rPr>
-              <w:t>) &gt; 1</w:t>
+              <w:t>() &gt; 1</w:t>
             </w:r>
             <w:r>
               <w:rPr>
@@ -658,33 +548,15 @@
                 <w:sz w:val="24"/>
                 <w:szCs w:val="24"/>
               </w:rPr>
-              <w:t xml:space="preserve">and the other </w:t>
-            </w:r>
-            <w:proofErr w:type="gramStart"/>
-            <w:r>
-              <w:rPr>
-                <w:rFonts w:ascii="Verdana" w:hAnsi="Verdana" w:cs="Arial"/>
-                <w:sz w:val="24"/>
-                <w:szCs w:val="24"/>
-              </w:rPr>
-              <w:t>beneficiaries</w:t>
-            </w:r>
-            <w:r>
-              <w:rPr>
-                <w:rFonts w:ascii="Verdana" w:hAnsi="Verdana" w:cs="Arial"/>
-                <w:sz w:val="24"/>
-                <w:szCs w:val="24"/>
-              </w:rPr>
-              <w:t>{</w:t>
-            </w:r>
-            <w:proofErr w:type="gramEnd"/>
-            <w:r>
-              <w:rPr>
-                <w:rFonts w:ascii="Verdana" w:hAnsi="Verdana" w:cs="Arial"/>
-                <w:sz w:val="24"/>
-                <w:szCs w:val="24"/>
-              </w:rPr>
-              <w:t xml:space="preserve">% endif %} must sign and date the </w:t>
+              <w:t>and the other beneficiaries</w:t>
+            </w:r>
+            <w:r>
+              <w:rPr>
+                <w:rFonts w:ascii="Verdana" w:hAnsi="Verdana" w:cs="Arial"/>
+                <w:sz w:val="24"/>
+                <w:szCs w:val="24"/>
+              </w:rPr>
+              <w:t xml:space="preserve">{% endif %} must sign and date the </w:t>
             </w:r>
             <w:r>
               <w:rPr>
@@ -796,9 +668,8 @@
                 <w:sz w:val="24"/>
                 <w:szCs w:val="24"/>
               </w:rPr>
-              <w:t xml:space="preserve">You must file the Notice of Death Affidavit with the Recorder of Deeds office in </w:t>
-            </w:r>
-            <w:proofErr w:type="gramStart"/>
+              <w:t>You must file the Notice of Death Affidavit with the Recorder of Deeds office in {</w:t>
+            </w:r>
             <w:r>
               <w:rPr>
                 <w:rFonts w:ascii="Verdana" w:hAnsi="Verdana" w:cs="Arial"/>
@@ -813,6 +684,142 @@
                 <w:sz w:val="24"/>
                 <w:szCs w:val="24"/>
               </w:rPr>
+              <w:t xml:space="preserve"> </w:t>
+            </w:r>
+            <w:proofErr w:type="spellStart"/>
+            <w:r>
+              <w:rPr>
+                <w:rFonts w:ascii="Verdana" w:hAnsi="Verdana" w:cs="Arial"/>
+                <w:sz w:val="24"/>
+                <w:szCs w:val="24"/>
+              </w:rPr>
+              <w:t>end_in_county</w:t>
+            </w:r>
+            <w:proofErr w:type="spellEnd"/>
+            <w:r>
+              <w:rPr>
+                <w:rFonts w:ascii="Verdana" w:hAnsi="Verdana" w:cs="Arial"/>
+                <w:sz w:val="24"/>
+                <w:szCs w:val="24"/>
+              </w:rPr>
+              <w:t>(</w:t>
+            </w:r>
+            <w:proofErr w:type="spellStart"/>
+            <w:r>
+              <w:rPr>
+                <w:rFonts w:ascii="Verdana" w:hAnsi="Verdana" w:cs="Arial"/>
+                <w:sz w:val="24"/>
+                <w:szCs w:val="24"/>
+              </w:rPr>
+              <w:t>notice_property</w:t>
+            </w:r>
+            <w:r>
+              <w:rPr>
+                <w:rFonts w:ascii="Verdana" w:hAnsi="Verdana" w:cs="Arial"/>
+                <w:sz w:val="24"/>
+                <w:szCs w:val="24"/>
+              </w:rPr>
+              <w:t>.county</w:t>
+            </w:r>
+            <w:proofErr w:type="spellEnd"/>
+            <w:r>
+              <w:rPr>
+                <w:rFonts w:ascii="Verdana" w:hAnsi="Verdana" w:cs="Arial"/>
+                <w:sz w:val="24"/>
+                <w:szCs w:val="24"/>
+              </w:rPr>
+              <w:t>)}}.</w:t>
+            </w:r>
+            <w:r>
+              <w:rPr>
+                <w:rFonts w:ascii="Verdana" w:hAnsi="Verdana" w:cs="Arial"/>
+                <w:sz w:val="24"/>
+                <w:szCs w:val="24"/>
+              </w:rPr>
+              <w:t xml:space="preserve"> You need to file it </w:t>
+            </w:r>
+            <w:r>
+              <w:rPr>
+                <w:rFonts w:ascii="Verdana" w:hAnsi="Verdana" w:cs="Arial"/>
+                <w:sz w:val="24"/>
+                <w:szCs w:val="24"/>
+              </w:rPr>
+              <w:t xml:space="preserve">within two years of </w:t>
+            </w:r>
+            <w:r>
+              <w:rPr>
+                <w:rFonts w:ascii="Verdana" w:hAnsi="Verdana" w:cs="Arial"/>
+                <w:sz w:val="24"/>
+                <w:szCs w:val="24"/>
+              </w:rPr>
+              <w:t xml:space="preserve">{% if </w:t>
+            </w:r>
+            <w:proofErr w:type="spellStart"/>
+            <w:r>
+              <w:rPr>
+                <w:rFonts w:ascii="Verdana" w:hAnsi="Verdana" w:cs="Arial"/>
+                <w:sz w:val="24"/>
+                <w:szCs w:val="24"/>
+              </w:rPr>
+              <w:t>other_owners_check</w:t>
+            </w:r>
+            <w:proofErr w:type="spellEnd"/>
+            <w:r>
+              <w:rPr>
+                <w:rFonts w:ascii="Verdana" w:hAnsi="Verdana" w:cs="Arial"/>
+                <w:sz w:val="24"/>
+                <w:szCs w:val="24"/>
+              </w:rPr>
+              <w:t xml:space="preserve"> </w:t>
+            </w:r>
+            <w:r>
+              <w:rPr>
+                <w:rFonts w:ascii="Verdana" w:hAnsi="Verdana" w:cs="Arial"/>
+                <w:sz w:val="24"/>
+                <w:szCs w:val="24"/>
+              </w:rPr>
+              <w:t xml:space="preserve">== “multiple” </w:t>
+            </w:r>
+            <w:r>
+              <w:rPr>
+                <w:rFonts w:ascii="Verdana" w:hAnsi="Verdana" w:cs="Arial"/>
+                <w:sz w:val="24"/>
+                <w:szCs w:val="24"/>
+              </w:rPr>
+              <w:t xml:space="preserve">and </w:t>
+            </w:r>
+            <w:r>
+              <w:rPr>
+                <w:rFonts w:ascii="Verdana" w:hAnsi="Verdana" w:cs="Arial"/>
+                <w:sz w:val="24"/>
+                <w:szCs w:val="24"/>
+              </w:rPr>
+              <w:t xml:space="preserve">not </w:t>
+            </w:r>
+            <w:proofErr w:type="spellStart"/>
+            <w:r>
+              <w:rPr>
+                <w:rFonts w:ascii="Verdana" w:hAnsi="Verdana" w:cs="Arial"/>
+                <w:sz w:val="24"/>
+                <w:szCs w:val="24"/>
+              </w:rPr>
+              <w:t>shared_owners_type</w:t>
+            </w:r>
+            <w:proofErr w:type="spellEnd"/>
+            <w:r>
+              <w:rPr>
+                <w:rFonts w:ascii="Verdana" w:hAnsi="Verdana" w:cs="Arial"/>
+                <w:sz w:val="24"/>
+                <w:szCs w:val="24"/>
+              </w:rPr>
+              <w:t xml:space="preserve"> == “Tenancy in common” %}the last living property owner’s death{% else %}</w:t>
+            </w:r>
+            <w:r>
+              <w:rPr>
+                <w:rFonts w:ascii="Verdana" w:hAnsi="Verdana" w:cs="Arial"/>
+                <w:sz w:val="24"/>
+                <w:szCs w:val="24"/>
+              </w:rPr>
               <w:t>{</w:t>
             </w:r>
             <w:r>
@@ -821,7 +828,7 @@
                 <w:sz w:val="24"/>
                 <w:szCs w:val="24"/>
               </w:rPr>
-              <w:t xml:space="preserve"> </w:t>
+              <w:t>{</w:t>
             </w:r>
             <w:proofErr w:type="spellStart"/>
             <w:r>
@@ -830,16 +837,7 @@
                 <w:sz w:val="24"/>
                 <w:szCs w:val="24"/>
               </w:rPr>
-              <w:t>end</w:t>
-            </w:r>
-            <w:proofErr w:type="gramEnd"/>
-            <w:r>
-              <w:rPr>
-                <w:rFonts w:ascii="Verdana" w:hAnsi="Verdana" w:cs="Arial"/>
-                <w:sz w:val="24"/>
-                <w:szCs w:val="24"/>
-              </w:rPr>
-              <w:t>_in_county</w:t>
+              <w:t>owner.name_full</w:t>
             </w:r>
             <w:proofErr w:type="spellEnd"/>
             <w:r>
@@ -848,243 +846,15 @@
                 <w:sz w:val="24"/>
                 <w:szCs w:val="24"/>
               </w:rPr>
-              <w:t>(</w:t>
-            </w:r>
-            <w:proofErr w:type="spellStart"/>
-            <w:r>
-              <w:rPr>
-                <w:rFonts w:ascii="Verdana" w:hAnsi="Verdana" w:cs="Arial"/>
-                <w:sz w:val="24"/>
-                <w:szCs w:val="24"/>
-              </w:rPr>
-              <w:t>notice_</w:t>
-            </w:r>
-            <w:proofErr w:type="gramStart"/>
-            <w:r>
-              <w:rPr>
-                <w:rFonts w:ascii="Verdana" w:hAnsi="Verdana" w:cs="Arial"/>
-                <w:sz w:val="24"/>
-                <w:szCs w:val="24"/>
-              </w:rPr>
-              <w:t>property</w:t>
-            </w:r>
-            <w:r>
-              <w:rPr>
-                <w:rFonts w:ascii="Verdana" w:hAnsi="Verdana" w:cs="Arial"/>
-                <w:sz w:val="24"/>
-                <w:szCs w:val="24"/>
-              </w:rPr>
-              <w:t>.county</w:t>
-            </w:r>
-            <w:proofErr w:type="spellEnd"/>
-            <w:proofErr w:type="gramEnd"/>
-            <w:r>
-              <w:rPr>
-                <w:rFonts w:ascii="Verdana" w:hAnsi="Verdana" w:cs="Arial"/>
-                <w:sz w:val="24"/>
-                <w:szCs w:val="24"/>
-              </w:rPr>
-              <w:t>)}}.</w:t>
-            </w:r>
-            <w:r>
-              <w:rPr>
-                <w:rFonts w:ascii="Verdana" w:hAnsi="Verdana" w:cs="Arial"/>
-                <w:sz w:val="24"/>
-                <w:szCs w:val="24"/>
-              </w:rPr>
-              <w:t xml:space="preserve"> You need to file it </w:t>
-            </w:r>
-            <w:r>
-              <w:rPr>
-                <w:rFonts w:ascii="Verdana" w:hAnsi="Verdana" w:cs="Arial"/>
-                <w:sz w:val="24"/>
-                <w:szCs w:val="24"/>
-              </w:rPr>
-              <w:t xml:space="preserve">within two years of </w:t>
-            </w:r>
-            <w:r>
-              <w:rPr>
-                <w:rFonts w:ascii="Verdana" w:hAnsi="Verdana" w:cs="Arial"/>
-                <w:sz w:val="24"/>
-                <w:szCs w:val="24"/>
-              </w:rPr>
-              <w:t xml:space="preserve">{% if </w:t>
-            </w:r>
-            <w:proofErr w:type="spellStart"/>
-            <w:r>
-              <w:rPr>
-                <w:rFonts w:ascii="Verdana" w:hAnsi="Verdana" w:cs="Arial"/>
-                <w:sz w:val="24"/>
-                <w:szCs w:val="24"/>
-              </w:rPr>
-              <w:t>other_owners_check</w:t>
-            </w:r>
-            <w:proofErr w:type="spellEnd"/>
-            <w:r>
-              <w:rPr>
-                <w:rFonts w:ascii="Verdana" w:hAnsi="Verdana" w:cs="Arial"/>
-                <w:sz w:val="24"/>
-                <w:szCs w:val="24"/>
-              </w:rPr>
-              <w:t xml:space="preserve"> </w:t>
-            </w:r>
-            <w:r>
-              <w:rPr>
-                <w:rFonts w:ascii="Verdana" w:hAnsi="Verdana" w:cs="Arial"/>
-                <w:sz w:val="24"/>
-                <w:szCs w:val="24"/>
-              </w:rPr>
-              <w:t xml:space="preserve">== “multiple” </w:t>
-            </w:r>
-            <w:r>
-              <w:rPr>
-                <w:rFonts w:ascii="Verdana" w:hAnsi="Verdana" w:cs="Arial"/>
-                <w:sz w:val="24"/>
-                <w:szCs w:val="24"/>
-              </w:rPr>
-              <w:t xml:space="preserve">and </w:t>
-            </w:r>
-            <w:r>
-              <w:rPr>
-                <w:rFonts w:ascii="Verdana" w:hAnsi="Verdana" w:cs="Arial"/>
-                <w:sz w:val="24"/>
-                <w:szCs w:val="24"/>
-              </w:rPr>
-              <w:t xml:space="preserve">not </w:t>
-            </w:r>
-            <w:proofErr w:type="spellStart"/>
-            <w:r>
-              <w:rPr>
-                <w:rFonts w:ascii="Verdana" w:hAnsi="Verdana" w:cs="Arial"/>
-                <w:sz w:val="24"/>
-                <w:szCs w:val="24"/>
-              </w:rPr>
-              <w:t>shared_owners_type</w:t>
-            </w:r>
-            <w:proofErr w:type="spellEnd"/>
-            <w:r>
-              <w:rPr>
-                <w:rFonts w:ascii="Verdana" w:hAnsi="Verdana" w:cs="Arial"/>
-                <w:sz w:val="24"/>
-                <w:szCs w:val="24"/>
-              </w:rPr>
-              <w:t xml:space="preserve"> == “Tenancy in common” </w:t>
-            </w:r>
-            <w:proofErr w:type="gramStart"/>
-            <w:r>
-              <w:rPr>
-                <w:rFonts w:ascii="Verdana" w:hAnsi="Verdana" w:cs="Arial"/>
-                <w:sz w:val="24"/>
-                <w:szCs w:val="24"/>
-              </w:rPr>
-              <w:t>%}the</w:t>
-            </w:r>
-            <w:proofErr w:type="gramEnd"/>
-            <w:r>
-              <w:rPr>
-                <w:rFonts w:ascii="Verdana" w:hAnsi="Verdana" w:cs="Arial"/>
-                <w:sz w:val="24"/>
-                <w:szCs w:val="24"/>
-              </w:rPr>
-              <w:t xml:space="preserve"> last living property owner’s </w:t>
-            </w:r>
-            <w:proofErr w:type="gramStart"/>
-            <w:r>
-              <w:rPr>
-                <w:rFonts w:ascii="Verdana" w:hAnsi="Verdana" w:cs="Arial"/>
-                <w:sz w:val="24"/>
-                <w:szCs w:val="24"/>
-              </w:rPr>
-              <w:t>death{</w:t>
-            </w:r>
-            <w:proofErr w:type="gramEnd"/>
-            <w:r>
-              <w:rPr>
-                <w:rFonts w:ascii="Verdana" w:hAnsi="Verdana" w:cs="Arial"/>
-                <w:sz w:val="24"/>
-                <w:szCs w:val="24"/>
-              </w:rPr>
-              <w:t xml:space="preserve">% else </w:t>
-            </w:r>
-            <w:proofErr w:type="gramStart"/>
-            <w:r>
-              <w:rPr>
-                <w:rFonts w:ascii="Verdana" w:hAnsi="Verdana" w:cs="Arial"/>
-                <w:sz w:val="24"/>
-                <w:szCs w:val="24"/>
-              </w:rPr>
-              <w:t>%}$</w:t>
-            </w:r>
-            <w:proofErr w:type="gramEnd"/>
-            <w:r>
-              <w:rPr>
-                <w:rFonts w:ascii="Verdana" w:hAnsi="Verdana" w:cs="Arial"/>
-                <w:sz w:val="24"/>
-                <w:szCs w:val="24"/>
-              </w:rPr>
-              <w:t>{</w:t>
-            </w:r>
-            <w:proofErr w:type="spellStart"/>
-            <w:r>
-              <w:rPr>
-                <w:rFonts w:ascii="Verdana" w:hAnsi="Verdana" w:cs="Arial"/>
-                <w:sz w:val="24"/>
-                <w:szCs w:val="24"/>
-              </w:rPr>
-              <w:t>owner.name_</w:t>
-            </w:r>
-            <w:proofErr w:type="gramStart"/>
-            <w:r>
-              <w:rPr>
-                <w:rFonts w:ascii="Verdana" w:hAnsi="Verdana" w:cs="Arial"/>
-                <w:sz w:val="24"/>
-                <w:szCs w:val="24"/>
-              </w:rPr>
-              <w:t>full</w:t>
-            </w:r>
-            <w:proofErr w:type="spellEnd"/>
-            <w:r>
-              <w:rPr>
-                <w:rFonts w:ascii="Verdana" w:hAnsi="Verdana" w:cs="Arial"/>
-                <w:sz w:val="24"/>
-                <w:szCs w:val="24"/>
-              </w:rPr>
-              <w:t>(</w:t>
-            </w:r>
-            <w:proofErr w:type="gramEnd"/>
-            <w:r>
-              <w:rPr>
-                <w:rFonts w:ascii="Verdana" w:hAnsi="Verdana" w:cs="Arial"/>
-                <w:sz w:val="24"/>
-                <w:szCs w:val="24"/>
-              </w:rPr>
-              <w:t xml:space="preserve">)}}’s </w:t>
-            </w:r>
-            <w:proofErr w:type="gramStart"/>
-            <w:r>
-              <w:rPr>
-                <w:rFonts w:ascii="Verdana" w:hAnsi="Verdana" w:cs="Arial"/>
-                <w:sz w:val="24"/>
-                <w:szCs w:val="24"/>
-              </w:rPr>
-              <w:t>death</w:t>
-            </w:r>
-            <w:r>
-              <w:rPr>
-                <w:rFonts w:ascii="Verdana" w:hAnsi="Verdana" w:cs="Arial"/>
-                <w:sz w:val="24"/>
-                <w:szCs w:val="24"/>
-              </w:rPr>
-              <w:t>{</w:t>
-            </w:r>
-            <w:proofErr w:type="gramEnd"/>
-            <w:r>
-              <w:rPr>
-                <w:rFonts w:ascii="Verdana" w:hAnsi="Verdana" w:cs="Arial"/>
-                <w:sz w:val="24"/>
-                <w:szCs w:val="24"/>
-              </w:rPr>
-              <w:t>% endif %}</w:t>
+              <w:t>()}}’s death</w:t>
+            </w:r>
+            <w:r>
+              <w:rPr>
+                <w:rFonts w:ascii="Verdana" w:hAnsi="Verdana" w:cs="Arial"/>
+                <w:sz w:val="24"/>
+                <w:szCs w:val="24"/>
+              </w:rPr>
+              <w:t>{% endif %}</w:t>
             </w:r>
             <w:r>
               <w:rPr>
@@ -2501,6 +2271,7 @@
   <w:style w:type="character" w:default="1" w:styleId="DefaultParagraphFont">
     <w:name w:val="Default Paragraph Font"/>
     <w:uiPriority w:val="1"/>
+    <w:semiHidden/>
     <w:unhideWhenUsed/>
   </w:style>
   <w:style w:type="table" w:default="1" w:styleId="TableNormal">

</xml_diff>